<commit_message>
Add Vol.108 isometric split squat notes and drop timestamp reminders.
Keep Ball Roll cues in the user's wording, start strength exercise 1 at 01:37, and add the second split-squat angle.

Co-authored-by: 36613453226Wallen <36613453226Wallen@users.noreply.github.com>
</commit_message>
<xml_diff>
--- a/files/隐藏宝石Vol.108：30min下肢综合训练计划（自重未完成）.docx
+++ b/files/隐藏宝石Vol.108：30min下肢综合训练计划（自重未完成）.docx
@@ -28,7 +28,7 @@
           <w:color w:val="B8860B"/>
           <w:sz w:val="22"/>
         </w:rPr>
-        <w:t>灵活度 → 基础肌力 → 快速离心　·　目前记到热身 + 正式动作一预告</w:t>
+        <w:t>灵活度 → 基础肌力 → 快速离心　·　目前记到热身 + 肌力动作一、二</w:t>
       </w:r>
     </w:p>
     <w:p>
@@ -82,7 +82,7 @@
           <w:color w:val="64748B"/>
           <w:sz w:val="18"/>
         </w:rPr>
-        <w:t>图一　封面 / 片头。1 对哑铃、3 个训练模块；本笔记先记自重能跟的部分。</w:t>
+        <w:t>图一　封面 / 片头。1 对哑铃、3 个训练模块；本笔记先记已经截到的热身和肌力动作。</w:t>
       </w:r>
     </w:p>
     <w:p>
@@ -96,7 +96,7 @@
           <w:color w:val="334155"/>
           <w:sz w:val="22"/>
         </w:rPr>
-        <w:t>状态：自重未完成。完整课 30 分钟，含灵活度、基础肌力、快速离心。下面只解析已经截到的热身，以及正式部分第一记预告。</w:t>
+        <w:t>状态：自重未完成。完整课 30 分钟，含灵活度、基础肌力、快速离心。下面解析已经截到的热身，以及下肢肌力动作一、二（两个角度的负重等长分腿蹲）。快速离心和自重替代以后再补。</w:t>
       </w:r>
     </w:p>
     <w:p>
@@ -107,10 +107,10 @@
         <w:rPr>
           <w:rFonts w:ascii="Microsoft YaHei" w:hAnsi="Microsoft YaHei" w:eastAsia="Microsoft YaHei"/>
           <w:b w:val="0"/>
-          <w:color w:val="9F1239"/>
+          <w:color w:val="334155"/>
           <w:sz w:val="22"/>
         </w:rPr>
-        <w:t>图一没有单独时间点。片头空降用 00:15；灵活度热身从 00:26 起。</w:t>
+        <w:t>片头空降 00:15；下肢关节灵活度热身从 00:26 起。</w:t>
       </w:r>
     </w:p>
     <w:p>
@@ -141,7 +141,7 @@
           <w:color w:val="334155"/>
           <w:sz w:val="22"/>
         </w:rPr>
-        <w:t>画面英文：Reps = 次数 / 重复次数（5–8 reps = 每组做 5 到 8 次）；Sets = 组数（1–2 sets = 做 1 到 2 组）。左右都做时，通常一轮左右算 1 次，以口播为准。</w:t>
+        <w:t>画面英文：Reps = 次数 / 重复次数（5–8 reps = 每组做 5 到 8 次）；Sets = 组数（1–2 sets = 做 1 到 2 组）；s = 秒（30–45s = 每组停住 30 到 45 秒，等长保持，不是上下蹲的次数）。左右都做时，通常一轮左右算 1 次，以口播为准。</w:t>
       </w:r>
     </w:p>
     <w:p>
@@ -431,20 +431,6 @@
     </w:p>
     <w:p>
       <w:pPr>
-        <w:spacing w:after="160" w:line="317" w:lineRule="auto"/>
-      </w:pPr>
-      <w:r>
-        <w:rPr>
-          <w:rFonts w:ascii="Microsoft YaHei" w:hAnsi="Microsoft YaHei" w:eastAsia="Microsoft YaHei"/>
-          <w:b w:val="0"/>
-          <w:color w:val="9F1239"/>
-          <w:sz w:val="20"/>
-        </w:rPr>
-        <w:t>【时间点待补】这张「双手后侧支撑」没有标秒数。方便的话补一个空降点。</w:t>
-      </w:r>
-    </w:p>
-    <w:p>
-      <w:pPr>
         <w:jc w:val="center"/>
       </w:pPr>
       <w:r>
@@ -591,20 +577,6 @@
     </w:p>
     <w:p>
       <w:pPr>
-        <w:spacing w:after="160" w:line="317" w:lineRule="auto"/>
-      </w:pPr>
-      <w:r>
-        <w:rPr>
-          <w:rFonts w:ascii="Microsoft YaHei" w:hAnsi="Microsoft YaHei" w:eastAsia="Microsoft YaHei"/>
-          <w:b w:val="0"/>
-          <w:color w:val="9F1239"/>
-          <w:sz w:val="20"/>
-        </w:rPr>
-        <w:t>【时间点待补】髋内旋外展特写、躯干直立特写都没有秒数。</w:t>
-      </w:r>
-    </w:p>
-    <w:p>
-      <w:pPr>
         <w:spacing w:after="140" w:line="317" w:lineRule="auto"/>
       </w:pPr>
       <w:r>
@@ -654,20 +626,6 @@
             </a:graphic>
           </wp:inline>
         </w:drawing>
-      </w:r>
-    </w:p>
-    <w:p>
-      <w:pPr>
-        <w:spacing w:after="160" w:line="317" w:lineRule="auto"/>
-      </w:pPr>
-      <w:r>
-        <w:rPr>
-          <w:rFonts w:ascii="Microsoft YaHei" w:hAnsi="Microsoft YaHei" w:eastAsia="Microsoft YaHei"/>
-          <w:b w:val="0"/>
-          <w:color w:val="9F1239"/>
-          <w:sz w:val="20"/>
-        </w:rPr>
-        <w:t>【时间点待补】「双手放躯干前侧」这张也没有秒数。进阶：手不撑地，躯干更要自己站住。</w:t>
       </w:r>
     </w:p>
     <w:p>
@@ -780,21 +738,7 @@
           <w:color w:val="334155"/>
           <w:sz w:val="22"/>
         </w:rPr>
-        <w:t>髋外旋侧：脚尖朝向约 45–60°，和身体朝向接近。</w:t>
-      </w:r>
-    </w:p>
-    <w:p>
-      <w:pPr>
-        <w:spacing w:after="60" w:line="317" w:lineRule="auto"/>
-      </w:pPr>
-      <w:r>
-        <w:rPr>
-          <w:rFonts w:ascii="Microsoft YaHei" w:hAnsi="Microsoft YaHei" w:eastAsia="Microsoft YaHei"/>
-          <w:b w:val="0"/>
-          <w:color w:val="334155"/>
-          <w:sz w:val="22"/>
-        </w:rPr>
-        <w:t>髋内旋侧：小腿尽量平行地面，脚尖自然朝前。</w:t>
+        <w:t>细节为髋外旋测脚尖朝向45-60度，和身体接近；髋内旋测小腿平行于地面，脚尖自然朝前。</w:t>
       </w:r>
     </w:p>
     <w:p>
@@ -808,21 +752,7 @@
           <w:color w:val="334155"/>
           <w:sz w:val="22"/>
         </w:rPr>
-        <w:t>手扶球，球在身体一侧，重心坐进髋，不要靠膝盖硬拧。</w:t>
-      </w:r>
-    </w:p>
-    <w:p>
-      <w:pPr>
-        <w:spacing w:after="160" w:line="317" w:lineRule="auto"/>
-      </w:pPr>
-      <w:r>
-        <w:rPr>
-          <w:rFonts w:ascii="Microsoft YaHei" w:hAnsi="Microsoft YaHei" w:eastAsia="Microsoft YaHei"/>
-          <w:b w:val="0"/>
-          <w:color w:val="9F1239"/>
-          <w:sz w:val="20"/>
-        </w:rPr>
-        <w:t>【图四未添加，防止文件太大】口播要点：保持躯干直立的同时，重心不要起来 / 起伏。【时间点待补】这句没有标秒数。</w:t>
+        <w:t>保持躯干直立的同时，重心不要起来/起伏。</w:t>
       </w:r>
     </w:p>
     <w:p>
@@ -870,7 +800,159 @@
           <w:color w:val="123524"/>
           <w:sz w:val="30"/>
         </w:rPr>
-        <w:t>【下肢肌力 · 正式动作一】负重等长分腿蹲</w:t>
+        <w:t>【下肢肌力】动作一　#1 Iso Split Squat　负重等长分腿蹲　【01:37开始动作】</w:t>
+      </w:r>
+    </w:p>
+    <w:p>
+      <w:pPr>
+        <w:spacing w:after="140" w:line="317" w:lineRule="auto"/>
+      </w:pPr>
+      <w:r>
+        <w:rPr>
+          <w:rFonts w:ascii="Microsoft YaHei" w:hAnsi="Microsoft YaHei" w:eastAsia="Microsoft YaHei"/>
+          <w:b/>
+          <w:color w:val="123524"/>
+          <w:sz w:val="22"/>
+        </w:rPr>
+        <w:t>字幕：「第一个就是我们的负重等长分腿蹲」</w:t>
+      </w:r>
+    </w:p>
+    <w:p>
+      <w:pPr>
+        <w:spacing w:after="40" w:line="317" w:lineRule="auto"/>
+      </w:pPr>
+      <w:r>
+        <w:rPr>
+          <w:rFonts w:ascii="Microsoft YaHei" w:hAnsi="Microsoft YaHei" w:eastAsia="Microsoft YaHei"/>
+          <w:b w:val="0"/>
+          <w:color w:val="334155"/>
+          <w:sz w:val="22"/>
+        </w:rPr>
+        <w:t>#1  序号</w:t>
+      </w:r>
+    </w:p>
+    <w:p>
+      <w:pPr>
+        <w:spacing w:after="40" w:line="317" w:lineRule="auto"/>
+      </w:pPr>
+      <w:r>
+        <w:rPr>
+          <w:rFonts w:ascii="Microsoft YaHei" w:hAnsi="Microsoft YaHei" w:eastAsia="Microsoft YaHei"/>
+          <w:b w:val="0"/>
+          <w:color w:val="334155"/>
+          <w:sz w:val="22"/>
+        </w:rPr>
+        <w:t>Iso Split Squat  负重等长分腿蹲（iso = 等长，停在最低附近，不上下弹）</w:t>
+      </w:r>
+    </w:p>
+    <w:p>
+      <w:pPr>
+        <w:spacing w:after="40" w:line="317" w:lineRule="auto"/>
+      </w:pPr>
+      <w:r>
+        <w:rPr>
+          <w:rFonts w:ascii="Microsoft YaHei" w:hAnsi="Microsoft YaHei" w:eastAsia="Microsoft YaHei"/>
+          <w:b w:val="0"/>
+          <w:color w:val="334155"/>
+          <w:sz w:val="22"/>
+        </w:rPr>
+        <w:t>30–45s  每组停住 30 到 45 秒（s = 秒）</w:t>
+      </w:r>
+    </w:p>
+    <w:p>
+      <w:pPr>
+        <w:spacing w:after="160" w:line="317" w:lineRule="auto"/>
+      </w:pPr>
+      <w:r>
+        <w:rPr>
+          <w:rFonts w:ascii="Microsoft YaHei" w:hAnsi="Microsoft YaHei" w:eastAsia="Microsoft YaHei"/>
+          <w:b w:val="0"/>
+          <w:color w:val="334155"/>
+          <w:sz w:val="22"/>
+        </w:rPr>
+        <w:t>1–2 Sets  做 1–2 组</w:t>
+      </w:r>
+    </w:p>
+    <w:p>
+      <w:pPr>
+        <w:jc w:val="center"/>
+      </w:pPr>
+      <w:r>
+        <w:drawing>
+          <wp:inline xmlns:a="http://schemas.openxmlformats.org/drawingml/2006/main" xmlns:pic="http://schemas.openxmlformats.org/drawingml/2006/picture">
+            <wp:extent cx="5472000" cy="3082934"/>
+            <wp:docPr id="9" name="Picture 9"/>
+            <wp:cNvGraphicFramePr>
+              <a:graphicFrameLocks noChangeAspect="1"/>
+            </wp:cNvGraphicFramePr>
+            <a:graphic>
+              <a:graphicData uri="http://schemas.openxmlformats.org/drawingml/2006/picture">
+                <pic:pic>
+                  <pic:nvPicPr>
+                    <pic:cNvPr id="0" name="s1.jpg"/>
+                    <pic:cNvPicPr/>
+                  </pic:nvPicPr>
+                  <pic:blipFill>
+                    <a:blip r:embed="rId19"/>
+                    <a:stretch>
+                      <a:fillRect/>
+                    </a:stretch>
+                  </pic:blipFill>
+                  <pic:spPr>
+                    <a:xfrm>
+                      <a:off x="0" y="0"/>
+                      <a:ext cx="5472000" cy="3082934"/>
+                    </a:xfrm>
+                    <a:prstGeom prst="rect"/>
+                  </pic:spPr>
+                </pic:pic>
+              </a:graphicData>
+            </a:graphic>
+          </wp:inline>
+        </w:drawing>
+      </w:r>
+    </w:p>
+    <w:p>
+      <w:pPr>
+        <w:spacing w:after="140" w:line="317" w:lineRule="auto"/>
+        <w:jc w:val="center"/>
+      </w:pPr>
+      <w:r>
+        <w:rPr>
+          <w:rFonts w:ascii="Microsoft YaHei" w:hAnsi="Microsoft YaHei" w:eastAsia="Microsoft YaHei"/>
+          <w:b w:val="0"/>
+          <w:color w:val="64748B"/>
+          <w:sz w:val="18"/>
+        </w:rPr>
+        <w:t>图四　下肢肌力动作一　Iso Split Squat　【01:37开始动作】</w:t>
+      </w:r>
+    </w:p>
+    <w:p>
+      <w:pPr>
+        <w:spacing w:after="60" w:line="317" w:lineRule="auto"/>
+      </w:pPr>
+      <w:r>
+        <w:rPr>
+          <w:rFonts w:ascii="Microsoft YaHei" w:hAnsi="Microsoft YaHei" w:eastAsia="Microsoft YaHei"/>
+          <w:b/>
+          <w:color w:val="123524"/>
+          <w:sz w:val="22"/>
+        </w:rPr>
+        <w:t>「此时重心在脚后跟，膝盖不超过脚尖」</w:t>
+      </w:r>
+    </w:p>
+    <w:p>
+      <w:pPr>
+        <w:spacing w:after="140" w:line="317" w:lineRule="auto"/>
+      </w:pPr>
+      <w:r>
+        <w:rPr>
+          <w:rFonts w:ascii="Microsoft YaHei" w:hAnsi="Microsoft YaHei" w:eastAsia="Microsoft YaHei"/>
+          <w:b/>
+          <w:color w:val="123524"/>
+          <w:sz w:val="22"/>
+        </w:rPr>
+        <w:t>「这与我们球场上的单推减速，或起跳的初期动作是相似的。」</w:t>
       </w:r>
     </w:p>
     <w:p>
@@ -884,21 +966,324 @@
           <w:color w:val="334155"/>
           <w:sz w:val="22"/>
         </w:rPr>
-        <w:t>视频里会给两个角度看同一动作：负重、分腿蹲住（等长 = 停在最低附近，不上下弹）。</w:t>
+        <w:t>图五、图六、图七是图四的补充（球场对照 + 脚底重心）。</w:t>
       </w:r>
     </w:p>
     <w:p>
       <w:pPr>
-        <w:spacing w:after="160" w:line="317" w:lineRule="auto"/>
+        <w:spacing w:after="140" w:line="317" w:lineRule="auto"/>
+      </w:pPr>
+      <w:r>
+        <w:rPr>
+          <w:rFonts w:ascii="Microsoft YaHei" w:hAnsi="Microsoft YaHei" w:eastAsia="Microsoft YaHei"/>
+          <w:b/>
+          <w:color w:val="123524"/>
+          <w:sz w:val="22"/>
+        </w:rPr>
+        <w:t>字幕：「膝盖不超过脚尖」</w:t>
+      </w:r>
+    </w:p>
+    <w:p>
+      <w:pPr>
+        <w:jc w:val="center"/>
+      </w:pPr>
+      <w:r>
+        <w:drawing>
+          <wp:inline xmlns:a="http://schemas.openxmlformats.org/drawingml/2006/main" xmlns:pic="http://schemas.openxmlformats.org/drawingml/2006/picture">
+            <wp:extent cx="5472000" cy="3407269"/>
+            <wp:docPr id="10" name="Picture 10"/>
+            <wp:cNvGraphicFramePr>
+              <a:graphicFrameLocks noChangeAspect="1"/>
+            </wp:cNvGraphicFramePr>
+            <a:graphic>
+              <a:graphicData uri="http://schemas.openxmlformats.org/drawingml/2006/picture">
+                <pic:pic>
+                  <pic:nvPicPr>
+                    <pic:cNvPr id="0" name="s1_knee.jpg"/>
+                    <pic:cNvPicPr/>
+                  </pic:nvPicPr>
+                  <pic:blipFill>
+                    <a:blip r:embed="rId20"/>
+                    <a:stretch>
+                      <a:fillRect/>
+                    </a:stretch>
+                  </pic:blipFill>
+                  <pic:spPr>
+                    <a:xfrm>
+                      <a:off x="0" y="0"/>
+                      <a:ext cx="5472000" cy="3407269"/>
+                    </a:xfrm>
+                    <a:prstGeom prst="rect"/>
+                  </pic:spPr>
+                </pic:pic>
+              </a:graphicData>
+            </a:graphic>
+          </wp:inline>
+        </w:drawing>
+      </w:r>
+    </w:p>
+    <w:p>
+      <w:pPr>
+        <w:spacing w:after="140" w:line="317" w:lineRule="auto"/>
+        <w:jc w:val="center"/>
       </w:pPr>
       <w:r>
         <w:rPr>
           <w:rFonts w:ascii="Microsoft YaHei" w:hAnsi="Microsoft YaHei" w:eastAsia="Microsoft YaHei"/>
           <w:b w:val="0"/>
-          <w:color w:val="9F1239"/>
-          <w:sz w:val="20"/>
+          <w:color w:val="64748B"/>
+          <w:sz w:val="18"/>
         </w:rPr>
-        <w:t>【时间点待补】正式动作一（两个角度的负重等长分腿蹲）还没有秒数，也还没有图。自重未完成：可以先徒手分腿蹲住，找前腿膝盖和后髋的位置，等补图再加重。</w:t>
+        <w:t>图五　球场对照：单推减速，膝盖不超过脚尖（图四补充）</w:t>
+      </w:r>
+    </w:p>
+    <w:p>
+      <w:pPr>
+        <w:spacing w:after="140" w:line="317" w:lineRule="auto"/>
+      </w:pPr>
+      <w:r>
+        <w:rPr>
+          <w:rFonts w:ascii="Microsoft YaHei" w:hAnsi="Microsoft YaHei" w:eastAsia="Microsoft YaHei"/>
+          <w:b/>
+          <w:color w:val="123524"/>
+          <w:sz w:val="22"/>
+        </w:rPr>
+        <w:t>字幕：「此时前脚掌的重心在脚后跟」</w:t>
+      </w:r>
+    </w:p>
+    <w:p>
+      <w:pPr>
+        <w:jc w:val="center"/>
+      </w:pPr>
+      <w:r>
+        <w:drawing>
+          <wp:inline xmlns:a="http://schemas.openxmlformats.org/drawingml/2006/main" xmlns:pic="http://schemas.openxmlformats.org/drawingml/2006/picture">
+            <wp:extent cx="5760000" cy="346466"/>
+            <wp:docPr id="11" name="Picture 11"/>
+            <wp:cNvGraphicFramePr>
+              <a:graphicFrameLocks noChangeAspect="1"/>
+            </wp:cNvGraphicFramePr>
+            <a:graphic>
+              <a:graphicData uri="http://schemas.openxmlformats.org/drawingml/2006/picture">
+                <pic:pic>
+                  <pic:nvPicPr>
+                    <pic:cNvPr id="0" name="s1_heel.jpg"/>
+                    <pic:cNvPicPr/>
+                  </pic:nvPicPr>
+                  <pic:blipFill>
+                    <a:blip r:embed="rId21"/>
+                    <a:stretch>
+                      <a:fillRect/>
+                    </a:stretch>
+                  </pic:blipFill>
+                  <pic:spPr>
+                    <a:xfrm>
+                      <a:off x="0" y="0"/>
+                      <a:ext cx="5760000" cy="346466"/>
+                    </a:xfrm>
+                    <a:prstGeom prst="rect"/>
+                  </pic:spPr>
+                </pic:pic>
+              </a:graphicData>
+            </a:graphic>
+          </wp:inline>
+        </w:drawing>
+      </w:r>
+    </w:p>
+    <w:p>
+      <w:pPr>
+        <w:spacing w:after="140" w:line="317" w:lineRule="auto"/>
+        <w:jc w:val="center"/>
+      </w:pPr>
+      <w:r>
+        <w:rPr>
+          <w:rFonts w:ascii="Microsoft YaHei" w:hAnsi="Microsoft YaHei" w:eastAsia="Microsoft YaHei"/>
+          <w:b w:val="0"/>
+          <w:color w:val="64748B"/>
+          <w:sz w:val="18"/>
+        </w:rPr>
+        <w:t>图六　特写：此时前脚掌的重心在脚后跟（图四补充）</w:t>
+      </w:r>
+    </w:p>
+    <w:p>
+      <w:pPr>
+        <w:spacing w:after="140" w:line="317" w:lineRule="auto"/>
+      </w:pPr>
+      <w:r>
+        <w:rPr>
+          <w:rFonts w:ascii="Microsoft YaHei" w:hAnsi="Microsoft YaHei" w:eastAsia="Microsoft YaHei"/>
+          <w:b/>
+          <w:color w:val="123524"/>
+          <w:sz w:val="22"/>
+        </w:rPr>
+        <w:t>字幕：「或者起跳时的初期动作是相似的」　画面时间 01:54</w:t>
+      </w:r>
+    </w:p>
+    <w:p>
+      <w:pPr>
+        <w:jc w:val="center"/>
+      </w:pPr>
+      <w:r>
+        <w:drawing>
+          <wp:inline xmlns:a="http://schemas.openxmlformats.org/drawingml/2006/main" xmlns:pic="http://schemas.openxmlformats.org/drawingml/2006/picture">
+            <wp:extent cx="5472000" cy="3594745"/>
+            <wp:docPr id="12" name="Picture 12"/>
+            <wp:cNvGraphicFramePr>
+              <a:graphicFrameLocks noChangeAspect="1"/>
+            </wp:cNvGraphicFramePr>
+            <a:graphic>
+              <a:graphicData uri="http://schemas.openxmlformats.org/drawingml/2006/picture">
+                <pic:pic>
+                  <pic:nvPicPr>
+                    <pic:cNvPr id="0" name="s1_jump.jpg"/>
+                    <pic:cNvPicPr/>
+                  </pic:nvPicPr>
+                  <pic:blipFill>
+                    <a:blip r:embed="rId22"/>
+                    <a:stretch>
+                      <a:fillRect/>
+                    </a:stretch>
+                  </pic:blipFill>
+                  <pic:spPr>
+                    <a:xfrm>
+                      <a:off x="0" y="0"/>
+                      <a:ext cx="5472000" cy="3594745"/>
+                    </a:xfrm>
+                    <a:prstGeom prst="rect"/>
+                  </pic:spPr>
+                </pic:pic>
+              </a:graphicData>
+            </a:graphic>
+          </wp:inline>
+        </w:drawing>
+      </w:r>
+    </w:p>
+    <w:p>
+      <w:pPr>
+        <w:spacing w:after="140" w:line="317" w:lineRule="auto"/>
+        <w:jc w:val="center"/>
+      </w:pPr>
+      <w:r>
+        <w:rPr>
+          <w:rFonts w:ascii="Microsoft YaHei" w:hAnsi="Microsoft YaHei" w:eastAsia="Microsoft YaHei"/>
+          <w:b w:val="0"/>
+          <w:color w:val="64748B"/>
+          <w:sz w:val="18"/>
+        </w:rPr>
+        <w:t>图七　球场对照：起跳初期　【01:54】（图四补充）</w:t>
+      </w:r>
+    </w:p>
+    <w:p>
+      <w:pPr>
+        <w:spacing w:after="140" w:line="317" w:lineRule="auto"/>
+      </w:pPr>
+      <w:r>
+        <w:rPr>
+          <w:rFonts w:ascii="Microsoft YaHei" w:hAnsi="Microsoft YaHei" w:eastAsia="Microsoft YaHei"/>
+          <w:b w:val="0"/>
+          <w:color w:val="334155"/>
+          <w:sz w:val="22"/>
+        </w:rPr>
+        <w:t>ps. 图七（起跳这张）最后一步起跳，左腿还提起来助力了抛投。</w:t>
+      </w:r>
+    </w:p>
+    <w:p>
+      <w:pPr>
+        <w:spacing w:before="240" w:after="120"/>
+        <w:pBdr>
+          <w:bottom w:val="single" w:sz="12" w:space="3" w:color="C9A227"/>
+        </w:pBdr>
+      </w:pPr>
+      <w:r>
+        <w:rPr>
+          <w:rFonts w:ascii="Microsoft YaHei" w:hAnsi="Microsoft YaHei" w:eastAsia="Microsoft YaHei"/>
+          <w:b/>
+          <w:color w:val="123524"/>
+          <w:sz w:val="30"/>
+        </w:rPr>
+        <w:t>【下肢肌力】动作二　膝盖超过脚尖</w:t>
+      </w:r>
+    </w:p>
+    <w:p>
+      <w:pPr>
+        <w:spacing w:after="140" w:line="317" w:lineRule="auto"/>
+      </w:pPr>
+      <w:r>
+        <w:rPr>
+          <w:rFonts w:ascii="Microsoft YaHei" w:hAnsi="Microsoft YaHei" w:eastAsia="Microsoft YaHei"/>
+          <w:b/>
+          <w:color w:val="123524"/>
+          <w:sz w:val="22"/>
+        </w:rPr>
+        <w:t>画面字：「动作2:」　字幕：「第二项训练的角度则是膝盖超过脚尖」</w:t>
+      </w:r>
+    </w:p>
+    <w:p>
+      <w:pPr>
+        <w:spacing w:after="140" w:line="317" w:lineRule="auto"/>
+      </w:pPr>
+      <w:r>
+        <w:rPr>
+          <w:rFonts w:ascii="Microsoft YaHei" w:hAnsi="Microsoft YaHei" w:eastAsia="Microsoft YaHei"/>
+          <w:b w:val="0"/>
+          <w:color w:val="334155"/>
+          <w:sz w:val="22"/>
+        </w:rPr>
+        <w:t>动作一是膝盖不超过脚尖、重心在脚后跟；动作二换成膝盖超过脚尖。两个角度都是负重等长分腿蹲。</w:t>
+      </w:r>
+    </w:p>
+    <w:p>
+      <w:pPr>
+        <w:jc w:val="center"/>
+      </w:pPr>
+      <w:r>
+        <w:drawing>
+          <wp:inline xmlns:a="http://schemas.openxmlformats.org/drawingml/2006/main" xmlns:pic="http://schemas.openxmlformats.org/drawingml/2006/picture">
+            <wp:extent cx="5472000" cy="3453792"/>
+            <wp:docPr id="13" name="Picture 13"/>
+            <wp:cNvGraphicFramePr>
+              <a:graphicFrameLocks noChangeAspect="1"/>
+            </wp:cNvGraphicFramePr>
+            <a:graphic>
+              <a:graphicData uri="http://schemas.openxmlformats.org/drawingml/2006/picture">
+                <pic:pic>
+                  <pic:nvPicPr>
+                    <pic:cNvPr id="0" name="s2.jpg"/>
+                    <pic:cNvPicPr/>
+                  </pic:nvPicPr>
+                  <pic:blipFill>
+                    <a:blip r:embed="rId23"/>
+                    <a:stretch>
+                      <a:fillRect/>
+                    </a:stretch>
+                  </pic:blipFill>
+                  <pic:spPr>
+                    <a:xfrm>
+                      <a:off x="0" y="0"/>
+                      <a:ext cx="5472000" cy="3453792"/>
+                    </a:xfrm>
+                    <a:prstGeom prst="rect"/>
+                  </pic:spPr>
+                </pic:pic>
+              </a:graphicData>
+            </a:graphic>
+          </wp:inline>
+        </w:drawing>
+      </w:r>
+    </w:p>
+    <w:p>
+      <w:pPr>
+        <w:spacing w:after="140" w:line="317" w:lineRule="auto"/>
+        <w:jc w:val="center"/>
+      </w:pPr>
+      <w:r>
+        <w:rPr>
+          <w:rFonts w:ascii="Microsoft YaHei" w:hAnsi="Microsoft YaHei" w:eastAsia="Microsoft YaHei"/>
+          <w:b w:val="0"/>
+          <w:color w:val="64748B"/>
+          <w:sz w:val="18"/>
+        </w:rPr>
+        <w:t>图八　下肢肌力动作二　同一分腿蹲的另一个角度：膝盖超过脚尖</w:t>
       </w:r>
     </w:p>
     <w:p>
@@ -929,7 +1314,7 @@
           <w:color w:val="334155"/>
           <w:sz w:val="22"/>
         </w:rPr>
-        <w:t>上面动作看完再扫。空降 00:15 进片；热身灵活度 00:26。</w:t>
+        <w:t>上面动作看完再扫。空降 00:15 进片；热身灵活度 00:26；肌力动作一 01:37。</w:t>
       </w:r>
     </w:p>
     <w:p>
@@ -966,7 +1351,7 @@
       <w:pPr>
         <w:jc w:val="center"/>
       </w:pPr>
-      <w:hyperlink r:id="rId19">
+      <w:hyperlink r:id="rId24">
         <w:r>
           <w:rPr>
             <w:rFonts w:ascii="Microsoft YaHei" w:eastAsia="Microsoft YaHei"/>
@@ -986,7 +1371,7 @@
         <w:drawing>
           <wp:inline xmlns:a="http://schemas.openxmlformats.org/drawingml/2006/main" xmlns:pic="http://schemas.openxmlformats.org/drawingml/2006/picture">
             <wp:extent cx="1872000" cy="1872000"/>
-            <wp:docPr id="9" name="Picture 9"/>
+            <wp:docPr id="14" name="Picture 14"/>
             <wp:cNvGraphicFramePr>
               <a:graphicFrameLocks noChangeAspect="1"/>
             </wp:cNvGraphicFramePr>
@@ -998,7 +1383,7 @@
                     <pic:cNvPicPr/>
                   </pic:nvPicPr>
                   <pic:blipFill>
-                    <a:blip r:embed="rId20"/>
+                    <a:blip r:embed="rId25"/>
                     <a:stretch>
                       <a:fillRect/>
                     </a:stretch>
@@ -1058,7 +1443,7 @@
         <w:color w:val="64748B"/>
         <w:sz w:val="16"/>
       </w:rPr>
-      <w:t>静态二维码编码官方链接  ·  时间点待补已标红</w:t>
+      <w:t>静态二维码编码官方链接  ·  空降 00:15</w:t>
     </w:r>
   </w:p>
 </w:ftr>

</xml_diff>